<commit_message>
Match drive-space button widths and darken dark-theme blue controls
</commit_message>
<xml_diff>
--- a/To do/windows_resurface.docx
+++ b/To do/windows_resurface.docx
@@ -259,7 +259,7 @@
       </w:pPr>
       <w:r>
         <w:rPr/>
-        <w:t>Disk Management</w:t>
+        <w:t>System Restore</w:t>
       </w:r>
     </w:p>
     <w:p>
@@ -273,63 +273,6 @@
       </w:pPr>
       <w:r>
         <w:rPr/>
-        <w:t>Disk Cleanup</w:t>
-      </w:r>
-    </w:p>
-    <w:p>
-      <w:pPr>
-        <w:pStyle w:val="ListBullet2"/>
-        <w:numPr>
-          <w:ilvl w:val="0"/>
-          <w:numId w:val="2"/>
-        </w:numPr>
-        <w:rPr/>
-      </w:pPr>
-      <w:r>
-        <w:rPr/>
-        <w:t>Storage Sense</w:t>
-      </w:r>
-    </w:p>
-    <w:p>
-      <w:pPr>
-        <w:pStyle w:val="ListBullet2"/>
-        <w:numPr>
-          <w:ilvl w:val="0"/>
-          <w:numId w:val="2"/>
-        </w:numPr>
-        <w:rPr/>
-      </w:pPr>
-      <w:r>
-        <w:rPr/>
-        <w:t>System Restore</w:t>
-      </w:r>
-    </w:p>
-    <w:p>
-      <w:pPr>
-        <w:pStyle w:val="ListBullet2"/>
-        <w:numPr>
-          <w:ilvl w:val="0"/>
-          <w:numId w:val="2"/>
-        </w:numPr>
-        <w:rPr/>
-      </w:pPr>
-      <w:r>
-        <w:rPr/>
-        <w:t>Prefetch</w:t>
-      </w:r>
-    </w:p>
-    <w:p>
-      <w:pPr>
-        <w:pStyle w:val="ListBullet2"/>
-        <w:numPr>
-          <w:ilvl w:val="0"/>
-          <w:numId w:val="2"/>
-        </w:numPr>
-        <w:rPr/>
-      </w:pPr>
-      <w:r>
-        <w:rPr/>
-        <w:t>Temp Files</w:t>
       </w:r>
     </w:p>
     <w:p>
@@ -350,13 +293,13 @@
         <w:pStyle w:val="ListBullet2"/>
         <w:numPr>
           <w:ilvl w:val="0"/>
-          <w:numId w:val="2"/>
+          <w:numId w:val="0"/>
         </w:numPr>
+        <w:ind w:hanging="0" w:start="720"/>
         <w:rPr/>
       </w:pPr>
       <w:r>
         <w:rPr/>
-        <w:t>Credential Manager</w:t>
       </w:r>
     </w:p>
     <w:p>
@@ -424,7 +367,7 @@
           <w:b/>
           <w:sz w:val="22"/>
         </w:rPr>
-        <w:t>Startup &amp; App Control</w:t>
+        <w:t>Security &amp; Protection</w:t>
       </w:r>
     </w:p>
     <w:p>
@@ -438,7 +381,7 @@
       </w:pPr>
       <w:r>
         <w:rPr/>
-        <w:t>Startup Folder</w:t>
+        <w:t>Windows Defender</w:t>
       </w:r>
     </w:p>
     <w:p>
@@ -452,146 +395,20 @@
       </w:pPr>
       <w:r>
         <w:rPr/>
-        <w:t>Common Startup Folder</w:t>
+        <w:t>Hosts File Editor</w:t>
       </w:r>
     </w:p>
     <w:p>
       <w:pPr>
-        <w:pStyle w:val="ListBullet2"/>
-        <w:numPr>
-          <w:ilvl w:val="0"/>
-          <w:numId w:val="2"/>
-        </w:numPr>
-        <w:rPr/>
-      </w:pPr>
-      <w:r>
-        <w:rPr/>
-        <w:t>Installed Programs</w:t>
-      </w:r>
-    </w:p>
-    <w:p>
-      <w:pPr>
         <w:pStyle w:val="Normal"/>
-        <w:rPr/>
-      </w:pPr>
-      <w:r>
+        <w:spacing w:before="0" w:after="200"/>
         <w:rPr>
           <w:b/>
           <w:sz w:val="22"/>
         </w:rPr>
-        <w:t>Security &amp; Protection</w:t>
-      </w:r>
-    </w:p>
-    <w:p>
-      <w:pPr>
-        <w:pStyle w:val="ListBullet2"/>
-        <w:numPr>
-          <w:ilvl w:val="0"/>
-          <w:numId w:val="2"/>
-        </w:numPr>
-        <w:rPr/>
       </w:pPr>
       <w:r>
         <w:rPr/>
-        <w:t>Windows Defender</w:t>
-      </w:r>
-    </w:p>
-    <w:p>
-      <w:pPr>
-        <w:pStyle w:val="ListBullet2"/>
-        <w:numPr>
-          <w:ilvl w:val="0"/>
-          <w:numId w:val="2"/>
-        </w:numPr>
-        <w:rPr/>
-      </w:pPr>
-      <w:r>
-        <w:rPr/>
-        <w:t>Hosts File Editor</w:t>
-      </w:r>
-    </w:p>
-    <w:p>
-      <w:pPr>
-        <w:pStyle w:val="Normal"/>
-        <w:rPr/>
-      </w:pPr>
-      <w:r>
-        <w:rPr>
-          <w:b/>
-          <w:sz w:val="22"/>
-        </w:rPr>
-        <w:t>Core System Tools</w:t>
-      </w:r>
-    </w:p>
-    <w:p>
-      <w:pPr>
-        <w:pStyle w:val="ListBullet2"/>
-        <w:numPr>
-          <w:ilvl w:val="0"/>
-          <w:numId w:val="2"/>
-        </w:numPr>
-        <w:rPr/>
-      </w:pPr>
-      <w:r>
-        <w:rPr/>
-        <w:t>Services</w:t>
-      </w:r>
-    </w:p>
-    <w:p>
-      <w:pPr>
-        <w:pStyle w:val="ListBullet2"/>
-        <w:numPr>
-          <w:ilvl w:val="0"/>
-          <w:numId w:val="2"/>
-        </w:numPr>
-        <w:rPr/>
-      </w:pPr>
-      <w:r>
-        <w:rPr/>
-        <w:t>Clipboard History</w:t>
-      </w:r>
-    </w:p>
-    <w:p>
-      <w:pPr>
-        <w:pStyle w:val="Normal"/>
-        <w:rPr/>
-      </w:pPr>
-      <w:r>
-        <w:rPr>
-          <w:b/>
-          <w:sz w:val="22"/>
-        </w:rPr>
-        <w:t>Display &amp; Hardware</w:t>
-      </w:r>
-    </w:p>
-    <w:p>
-      <w:pPr>
-        <w:pStyle w:val="ListBullet2"/>
-        <w:numPr>
-          <w:ilvl w:val="0"/>
-          <w:numId w:val="2"/>
-        </w:numPr>
-        <w:rPr/>
-      </w:pPr>
-      <w:r>
-        <w:rPr/>
-        <w:t>Advanced Display Settings</w:t>
-      </w:r>
-    </w:p>
-    <w:p>
-      <w:pPr>
-        <w:pStyle w:val="ListBullet2"/>
-        <w:numPr>
-          <w:ilvl w:val="0"/>
-          <w:numId w:val="2"/>
-        </w:numPr>
-        <w:spacing w:before="0" w:after="200"/>
-        <w:contextualSpacing/>
-        <w:rPr/>
-      </w:pPr>
-      <w:r>
-        <w:rPr/>
-        <w:t>Sound Devices</w:t>
       </w:r>
     </w:p>
     <w:sectPr>

</xml_diff>

<commit_message>
Add hidden Windows utility launchers to right-side panel
</commit_message>
<xml_diff>
--- a/To do/windows_resurface.docx
+++ b/To do/windows_resurface.docx
@@ -57,13 +57,42 @@
         <w:pStyle w:val="ListBullet"/>
         <w:numPr>
           <w:ilvl w:val="0"/>
+          <w:numId w:val="0"/>
+        </w:numPr>
+        <w:ind w:hanging="0" w:start="360"/>
+        <w:rPr/>
+      </w:pPr>
+      <w:r>
+        <w:rPr/>
+        <w:t>Windows Update Troubleshooter</w:t>
+      </w:r>
+    </w:p>
+    <w:p>
+      <w:pPr>
+        <w:pStyle w:val="ListBullet"/>
+        <w:numPr>
+          <w:ilvl w:val="0"/>
           <w:numId w:val="1"/>
         </w:numPr>
         <w:rPr/>
       </w:pPr>
       <w:r>
         <w:rPr/>
-        <w:t>Local Users &amp; Groups</w:t>
+        <w:t>Windows Defender / Virus &amp; Threat Protection</w:t>
+      </w:r>
+    </w:p>
+    <w:p>
+      <w:pPr>
+        <w:pStyle w:val="ListBullet"/>
+        <w:numPr>
+          <w:ilvl w:val="0"/>
+          <w:numId w:val="1"/>
+        </w:numPr>
+        <w:rPr/>
+      </w:pPr>
+      <w:r>
+        <w:rPr/>
+        <w:t>System Restore / Restore Points</w:t>
       </w:r>
     </w:p>
     <w:p>
@@ -78,7 +107,7 @@
       </w:pPr>
       <w:r>
         <w:rPr/>
-        <w:t>Windows Update Troubleshooter</w:t>
+        <w:t>Hosts File Editor</w:t>
       </w:r>
     </w:p>
     <w:p>
@@ -92,7 +121,7 @@
       </w:pPr>
       <w:r>
         <w:rPr/>
-        <w:t>Windows Defender / Virus &amp; Threat Protection</w:t>
+        <w:t>Windows Memory Diagnostic</w:t>
       </w:r>
     </w:p>
     <w:p>
@@ -106,214 +135,7 @@
       </w:pPr>
       <w:r>
         <w:rPr/>
-        <w:t>System Restore / Restore Points</w:t>
-      </w:r>
-    </w:p>
-    <w:p>
-      <w:pPr>
-        <w:pStyle w:val="ListBullet"/>
-        <w:numPr>
-          <w:ilvl w:val="0"/>
-          <w:numId w:val="0"/>
-        </w:numPr>
-        <w:ind w:hanging="0" w:start="360"/>
-        <w:rPr/>
-      </w:pPr>
-      <w:r>
-        <w:rPr/>
-        <w:t>Hosts File Editor</w:t>
-      </w:r>
-    </w:p>
-    <w:p>
-      <w:pPr>
-        <w:pStyle w:val="ListBullet"/>
-        <w:numPr>
-          <w:ilvl w:val="0"/>
-          <w:numId w:val="1"/>
-        </w:numPr>
-        <w:rPr/>
-      </w:pPr>
-      <w:r>
-        <w:rPr/>
-        <w:t>Windows Memory Diagnostic</w:t>
-      </w:r>
-    </w:p>
-    <w:p>
-      <w:pPr>
-        <w:pStyle w:val="ListBullet"/>
-        <w:numPr>
-          <w:ilvl w:val="0"/>
-          <w:numId w:val="1"/>
-        </w:numPr>
-        <w:rPr/>
-      </w:pPr>
-      <w:r>
-        <w:rPr/>
         <w:t>AutoPlay Settings (control /name Microsoft.AutoPlay)</w:t>
-      </w:r>
-    </w:p>
-    <w:p>
-      <w:pPr>
-        <w:pStyle w:val="Normal"/>
-        <w:rPr/>
-      </w:pPr>
-      <w:r>
-        <w:rPr>
-          <w:b/>
-          <w:sz w:val="22"/>
-        </w:rPr>
-        <w:t>System Diagnostics</w:t>
-      </w:r>
-    </w:p>
-    <w:p>
-      <w:pPr>
-        <w:pStyle w:val="ListBullet2"/>
-        <w:numPr>
-          <w:ilvl w:val="0"/>
-          <w:numId w:val="2"/>
-        </w:numPr>
-        <w:rPr/>
-      </w:pPr>
-      <w:r>
-        <w:rPr/>
-        <w:t>Event Viewer</w:t>
-      </w:r>
-    </w:p>
-    <w:p>
-      <w:pPr>
-        <w:pStyle w:val="ListBullet2"/>
-        <w:numPr>
-          <w:ilvl w:val="0"/>
-          <w:numId w:val="2"/>
-        </w:numPr>
-        <w:rPr/>
-      </w:pPr>
-      <w:r>
-        <w:rPr/>
-        <w:t>System Information</w:t>
-      </w:r>
-    </w:p>
-    <w:p>
-      <w:pPr>
-        <w:pStyle w:val="ListBullet2"/>
-        <w:numPr>
-          <w:ilvl w:val="0"/>
-          <w:numId w:val="2"/>
-        </w:numPr>
-        <w:rPr/>
-      </w:pPr>
-      <w:r>
-        <w:rPr/>
-        <w:t>Reliability Monitor</w:t>
-      </w:r>
-    </w:p>
-    <w:p>
-      <w:pPr>
-        <w:pStyle w:val="ListBullet2"/>
-        <w:numPr>
-          <w:ilvl w:val="0"/>
-          <w:numId w:val="2"/>
-        </w:numPr>
-        <w:rPr/>
-      </w:pPr>
-      <w:r>
-        <w:rPr/>
-        <w:t>Resource Monitor</w:t>
-      </w:r>
-    </w:p>
-    <w:p>
-      <w:pPr>
-        <w:pStyle w:val="ListBullet2"/>
-        <w:numPr>
-          <w:ilvl w:val="0"/>
-          <w:numId w:val="2"/>
-        </w:numPr>
-        <w:rPr/>
-      </w:pPr>
-      <w:r>
-        <w:rPr/>
-        <w:t>Windows Memory Diagnostic</w:t>
-      </w:r>
-    </w:p>
-    <w:p>
-      <w:pPr>
-        <w:pStyle w:val="Normal"/>
-        <w:rPr/>
-      </w:pPr>
-      <w:r>
-        <w:rPr>
-          <w:b/>
-          <w:sz w:val="22"/>
-        </w:rPr>
-        <w:t>System Maintenance</w:t>
-      </w:r>
-    </w:p>
-    <w:p>
-      <w:pPr>
-        <w:pStyle w:val="ListBullet2"/>
-        <w:numPr>
-          <w:ilvl w:val="0"/>
-          <w:numId w:val="2"/>
-        </w:numPr>
-        <w:rPr/>
-      </w:pPr>
-      <w:r>
-        <w:rPr/>
-        <w:t>System Restore</w:t>
-      </w:r>
-    </w:p>
-    <w:p>
-      <w:pPr>
-        <w:pStyle w:val="ListBullet2"/>
-        <w:numPr>
-          <w:ilvl w:val="0"/>
-          <w:numId w:val="2"/>
-        </w:numPr>
-        <w:rPr/>
-      </w:pPr>
-      <w:r>
-        <w:rPr/>
-      </w:r>
-    </w:p>
-    <w:p>
-      <w:pPr>
-        <w:pStyle w:val="Normal"/>
-        <w:rPr/>
-      </w:pPr>
-      <w:r>
-        <w:rPr>
-          <w:b/>
-          <w:sz w:val="22"/>
-        </w:rPr>
-        <w:t>Accounts &amp; Credentials</w:t>
-      </w:r>
-    </w:p>
-    <w:p>
-      <w:pPr>
-        <w:pStyle w:val="ListBullet2"/>
-        <w:numPr>
-          <w:ilvl w:val="0"/>
-          <w:numId w:val="0"/>
-        </w:numPr>
-        <w:ind w:hanging="0" w:start="720"/>
-        <w:rPr/>
-      </w:pPr>
-      <w:r>
-        <w:rPr/>
-      </w:r>
-    </w:p>
-    <w:p>
-      <w:pPr>
-        <w:pStyle w:val="ListBullet2"/>
-        <w:numPr>
-          <w:ilvl w:val="0"/>
-          <w:numId w:val="2"/>
-        </w:numPr>
-        <w:rPr/>
-      </w:pPr>
-      <w:r>
-        <w:rPr/>
-        <w:t>Local Users &amp; Groups</w:t>
       </w:r>
     </w:p>
     <w:p>

</xml_diff>